<commit_message>
Diagnóstico con corte del 23 de octubre en resúmenes, ajustes y briefs
Índices recalculados con el mismo método del corte anterior, verificado
sobre las 415 personas de ese corte. Grupos y candidatos recalculados.

Co-Authored-By: Claude Opus 5.5 <noreply@anthropic.com>
Claude-Session: https://claude.ai/code/session_01Ja1vbRoiAwxTq3mLFGrVau
</commit_message>
<xml_diff>
--- a/docentes/administrativo/Ajustes a los talleres · perfil administrativo.docx
+++ b/docentes/administrativo/Ajustes a los talleres · perfil administrativo.docx
@@ -65,7 +65,7 @@
           <w:sz w:val="21"/>
           <w:szCs w:val="21"/>
         </w:rPr>
-        <w:t xml:space="preserve">Diagnóstico con corte del 14 de octubre de 2026, resultados del perfil administrativo. Política de uso de inteligencia artificial y gestión de riesgo de GYJ Ferreterías S.A., código TH-PT-003, versión 1.</w:t>
+        <w:t xml:space="preserve">Diagnóstico con corte del 23 de octubre de 2026, resultados del perfil administrativo. Política de uso de inteligencia artificial y gestión de riesgo de GYJ Ferreterías S.A., código TH-PT-003, versión 1.</w:t>
       </w:r>
     </w:p>
     <w:p>
@@ -82,7 +82,7 @@
           <w:sz w:val="21"/>
           <w:szCs w:val="21"/>
         </w:rPr>
-        <w:t xml:space="preserve">Pivot Power · documento para el docente del perfil administrativo · 19 de octubre de 2026 · fechas según el cronograma ajustado del 19 de octubre</w:t>
+        <w:t xml:space="preserve">Pivot Power · documento para el docente del perfil administrativo · 27 de octubre de 2026 · fechas según el cronograma ajustado del 19 de octubre</w:t>
       </w:r>
     </w:p>
     <w:p>
@@ -1309,7 +1309,7 @@
           <w:sz w:val="21"/>
           <w:szCs w:val="21"/>
         </w:rPr>
-        <w:t xml:space="preserve">G1 Arranque, 70 personas: el bloque «Primer contacto guiado» del T1 se extiende y el consultorio del Taller 1 se reserva para ellas. El docente las nombra al inicio y las invita en persona.</w:t>
+        <w:t xml:space="preserve">G1 Arranque, 82 personas: el bloque «Primer contacto guiado» del T1 se extiende y el consultorio del Taller 1 se reserva para ellas. El docente las nombra al inicio y las invita en persona.</w:t>
       </w:r>
     </w:p>
     <w:p>
@@ -1328,7 +1328,7 @@
           <w:sz w:val="21"/>
           <w:szCs w:val="21"/>
         </w:rPr>
-        <w:t xml:space="preserve">G4 Referentes, 72 personas: durante la práctica apoyan a dos compañeros cada una, como ya dice el temario. Los 27 candidatos administrativos a formador interno empiezan ahí su rol.</w:t>
+        <w:t xml:space="preserve">G4 Referentes, 84 personas: durante la práctica apoyan a dos compañeros cada una, como ya dice el temario. Los 33 candidatos administrativos a formador interno empiezan ahí su rol.</w:t>
       </w:r>
     </w:p>
     <w:p>
@@ -1395,7 +1395,7 @@
           <w:sz w:val="21"/>
           <w:szCs w:val="21"/>
         </w:rPr>
-        <w:t xml:space="preserve">21 administrativos sin computador propio necesitan sala con equipo o una pareja de trabajo. Gestión Humana asigna el lugar antes de cada encuentro 1.</w:t>
+        <w:t xml:space="preserve">24 administrativos sin computador propio necesitan sala con equipo o una pareja de trabajo. Gestión Humana asigna el lugar antes de cada encuentro 1.</w:t>
       </w:r>
     </w:p>
     <w:p>
@@ -1414,7 +1414,7 @@
           <w:sz w:val="21"/>
           <w:szCs w:val="21"/>
         </w:rPr>
-        <w:t xml:space="preserve">La grabación en la plataforma deja de ser opcional: 66 personas reportan conexión inestable.</w:t>
+        <w:t xml:space="preserve">La grabación en la plataforma deja de ser opcional: 53 administrativos reportan conexión intermitente o solo datos del celular.</w:t>
       </w:r>
     </w:p>
     <w:p>
@@ -1476,7 +1476,7 @@
           <w:sz w:val="21"/>
           <w:szCs w:val="21"/>
         </w:rPr>
-        <w:t xml:space="preserve">El diagnóstico estima 1.900 horas semanales de trabajo repetitivo en el programa. Para que esa cifra sirva al cierre, el formato pide minutos por vez y veces por semana, y el reporte mensual suma las horas liberadas. El campo ya existe en el formato; lo que cambia es que el docente lo exige lleno en cada encuentro 2.</w:t>
+        <w:t xml:space="preserve">El diagnóstico estima cerca de 2.200 horas semanales de trabajo repetitivo en las 482 personas que respondieron. Para que esa cifra sirva al cierre, el formato pide minutos por vez y veces por semana, y el reporte mensual suma las horas liberadas. El campo ya existe en el formato; lo que cambia es que el docente lo exige lleno en cada encuentro 2.</w:t>
       </w:r>
     </w:p>
     <w:p>
@@ -1748,7 +1748,7 @@
                 <w:sz w:val="19"/>
                 <w:szCs w:val="19"/>
               </w:rPr>
-              <w:t xml:space="preserve">Ítem D_5 con 74,8 %, el más bajo del perfil.</w:t>
+              <w:t xml:space="preserve">Ítem D_5 con 74,7 %, el más bajo del perfil.</w:t>
             </w:r>
           </w:p>
         </w:tc>
@@ -2042,7 +2042,7 @@
                 <w:sz w:val="19"/>
                 <w:szCs w:val="19"/>
               </w:rPr>
-              <w:t xml:space="preserve">114 administrativos de 282 sin firmar o sin saber de la política.</w:t>
+              <w:t xml:space="preserve">115 administrativos de 332 sin firmar o sin saber de la política.</w:t>
             </w:r>
           </w:p>
         </w:tc>
@@ -2479,7 +2479,7 @@
                 <w:sz w:val="19"/>
                 <w:szCs w:val="19"/>
               </w:rPr>
-              <w:t xml:space="preserve">Ítem D_5 con 74,8 %.</w:t>
+              <w:t xml:space="preserve">Ítem D_5 con 74,7 %.</w:t>
             </w:r>
           </w:p>
         </w:tc>
@@ -2577,7 +2577,7 @@
                 <w:sz w:val="19"/>
                 <w:szCs w:val="19"/>
               </w:rPr>
-              <w:t xml:space="preserve">89 administrativos dedican más de 5 horas semanales a tareas repetitivas.</w:t>
+              <w:t xml:space="preserve">100 administrativos dedican más de 5 horas semanales a tareas repetitivas.</w:t>
             </w:r>
           </w:p>
         </w:tc>
@@ -2818,7 +2818,7 @@
                 <w:sz w:val="19"/>
                 <w:szCs w:val="19"/>
               </w:rPr>
-              <w:t xml:space="preserve">185 de 282 administrativos llevan pendientes en papel o en el correo; 26 de memoria; 22 con herramienta compartida.</w:t>
+              <w:t xml:space="preserve">220 de 332 administrativos llevan pendientes en papel o en el correo; 34 de memoria; 23 con herramienta compartida.</w:t>
             </w:r>
           </w:p>
         </w:tc>
@@ -3014,7 +3014,7 @@
                 <w:sz w:val="19"/>
                 <w:szCs w:val="19"/>
               </w:rPr>
-              <w:t xml:space="preserve">Ítem D_1 con 79,8 %.</w:t>
+              <w:t xml:space="preserve">Ítem D_1 con 78,6 %.</w:t>
             </w:r>
           </w:p>
         </w:tc>
@@ -3255,7 +3255,7 @@
                 <w:sz w:val="19"/>
                 <w:szCs w:val="19"/>
               </w:rPr>
-              <w:t xml:space="preserve">Ítem S_5 con 78,4 %, segundo más bajo del perfil.</w:t>
+              <w:t xml:space="preserve">Ítem S_5 con 76,8 %, segundo más bajo del perfil.</w:t>
             </w:r>
           </w:p>
         </w:tc>
@@ -3353,7 +3353,7 @@
                 <w:sz w:val="19"/>
                 <w:szCs w:val="19"/>
               </w:rPr>
-              <w:t xml:space="preserve">103 administrativos reportan informes duplicados; otros 22 % creen que sí.</w:t>
+              <w:t xml:space="preserve">121 administrativos reportan informes duplicados; otros 69 creen que sí.</w:t>
             </w:r>
           </w:p>
         </w:tc>
@@ -3451,7 +3451,7 @@
                 <w:sz w:val="19"/>
                 <w:szCs w:val="19"/>
               </w:rPr>
-              <w:t xml:space="preserve">79 personas rehacen en archivo propio; 72 registran en Excel propio; 104 en UnoE.</w:t>
+              <w:t xml:space="preserve">57 administrativos rehacen en archivo propio; 80 registran en Excel propio; 127 en UnoE.</w:t>
             </w:r>
           </w:p>
         </w:tc>
@@ -3585,7 +3585,7 @@
                 <w:sz w:val="19"/>
                 <w:szCs w:val="19"/>
               </w:rPr>
-              <w:t xml:space="preserve">Documentar el propio trabajo: el ejercicio de la guía de una página se conecta con las 48 personas que dicen que lo suyo está sin escribir.</w:t>
+              <w:t xml:space="preserve">Documentar el propio trabajo: el ejercicio de la guía de una página se conecta con los 32 administrativos que dicen que lo suyo está sin escribir.</w:t>
             </w:r>
           </w:p>
         </w:tc>
@@ -3647,7 +3647,7 @@
                 <w:sz w:val="19"/>
                 <w:szCs w:val="19"/>
               </w:rPr>
-              <w:t xml:space="preserve">Ítem de mentalidad con 48 respuestas en 1 o 2.</w:t>
+              <w:t xml:space="preserve">Ítem de mentalidad con 32 administrativos en 1 o 2.</w:t>
             </w:r>
           </w:p>
         </w:tc>
@@ -3888,7 +3888,7 @@
                 <w:sz w:val="19"/>
                 <w:szCs w:val="19"/>
               </w:rPr>
-              <w:t xml:space="preserve">184 administrativos responden que el CRM no aplica; su sistema es UnoE. Política 9.</w:t>
+              <w:t xml:space="preserve">219 administrativos responden que el CRM no aplica; su sistema es UnoE. Política 9.</w:t>
             </w:r>
           </w:p>
         </w:tc>
@@ -4084,7 +4084,7 @@
                 <w:sz w:val="19"/>
                 <w:szCs w:val="19"/>
               </w:rPr>
-              <w:t xml:space="preserve">27 candidatos administrativos; 70 personas en G1.</w:t>
+              <w:t xml:space="preserve">33 candidatos administrativos; 82 personas en G1.</w:t>
             </w:r>
           </w:p>
         </w:tc>
@@ -4325,7 +4325,7 @@
                 <w:sz w:val="19"/>
                 <w:szCs w:val="19"/>
               </w:rPr>
-              <w:t xml:space="preserve">1.900 horas semanales estimadas.</w:t>
+              <w:t xml:space="preserve">Cerca de 2.200 horas semanales estimadas.</w:t>
             </w:r>
           </w:p>
         </w:tc>
@@ -4423,7 +4423,7 @@
                 <w:sz w:val="19"/>
                 <w:szCs w:val="19"/>
               </w:rPr>
-              <w:t xml:space="preserve">38 % afirmativo más 22 % «creo que sí».</w:t>
+              <w:t xml:space="preserve">36 % afirmativo más 21 % «creo que sí».</w:t>
             </w:r>
           </w:p>
         </w:tc>
@@ -5191,7 +5191,7 @@
         <w:sz w:val="16"/>
         <w:szCs w:val="16"/>
       </w:rPr>
-      <w:t xml:space="preserve">Pivot Power · documento de trabajo · 19 de octubre de 2026</w:t>
+      <w:t xml:space="preserve">Pivot Power · documento de trabajo · 27 de octubre de 2026</w:t>
     </w:r>
     <w:r>
       <w:rPr>

</xml_diff>